<commit_message>
Agregar identificación de cartas por imagen con Gemini Vision.
En Render, Gemini lee número, nombre y coste; el backend recupera el texto
exacto desde cards.json. Ollama/minicpm-v sigue disponible como proveedor
local. También se limitan formatos, tamaño y cantidad de imágenes.

Co-authored-by: Cursor <cursoragent@cursor.com>
</commit_message>
<xml_diff>
--- a/informe/Entrega_final_Riftbound_Chatbot.docx
+++ b/informe/Entrega_final_Riftbound_Chatbot.docx
@@ -74,7 +74,7 @@
           <w:i/>
           <w:sz w:val="24"/>
         </w:rPr>
-        <w:t>Juez de mesa con RAG, visión local y verificación de rulings</w:t>
+        <w:t>Juez de mesa con RAG, visión de cartas y verificación de rulings</w:t>
       </w:r>
     </w:p>
     <w:p>
@@ -248,7 +248,7 @@
                 <w:i w:val="0"/>
                 <w:sz w:val="18"/>
               </w:rPr>
-              <w:t>PENDIENTE — URL de Cloudflare Tunnel (ver README)</w:t>
+              <w:t>https://riftbound-rules-chatbot.onrender.com</w:t>
             </w:r>
           </w:p>
         </w:tc>
@@ -583,7 +583,7 @@
           <w:i w:val="0"/>
           <w:sz w:val="22"/>
         </w:rPr>
-        <w:t>Entrada: texto y, opcionalmente, fotos. El frontend manda FormData a /ask-stream. FastAPI orquesta. Salida: veredicto, confianza, explicación y citas. IA: minicpm-v (visión), Gemini draft y Gemini verifier. Tradicional: búsqueda de cartas en JSON, Chroma, pineado de mecánicas, atajos determinísticos, validación de IDs de cita. Memoria persistente de conocimiento: ChromaDB en disco (reglamento indexado). Memoria de sesión: conversation_history en RAM (últimos 10 turnos), se limpia al recargar o POST /reset. No hay base de usuarios.</w:t>
+        <w:t>Entrada: texto y, opcionalmente, fotos. El frontend manda FormData a /ask-stream. FastAPI orquesta. Salida: veredicto, confianza, explicación y citas. IA: Gemini Vision en producción (minicpm-v local), Gemini draft y verifier. Tradicional: búsqueda de cartas en JSON, Chroma, pineado de mecánicas, atajos determinísticos, validación de IDs de cita. Memoria persistente de conocimiento: ChromaDB en disco (reglamento indexado). Memoria de sesión: conversation_history en RAM (últimos 10 turnos), se limpia al recargar o POST /reset. No hay base de usuarios.</w:t>
       </w:r>
     </w:p>
     <w:p>
@@ -776,7 +776,7 @@
           <w:i w:val="0"/>
           <w:sz w:val="22"/>
         </w:rPr>
-        <w:t>Evolución respecto de la entrega de medio ciclo: el diseño ya planteaba RAG + visión + Gemini. Lo que se implementó después es el ciclo de decisión (draft → verifier → re-retrieve), la validación determinística de citas, atajos para interacciones ya juzgadas, el streaming SSE para no dejar la UI en silencio, y la publicación por túnel. La memoria persistente no es un chat histórico en la nube: es el índice Chroma del reglamento, que sobrevive al reinicio. El historial de la partida vive en RAM a propósito (privacidad).</w:t>
+        <w:t>Evolución respecto de la entrega de medio ciclo: el diseño ya planteaba RAG + visión + Gemini. Lo que se implementó después es el ciclo de decisión (draft → verifier → re-retrieve), la validación determinística de citas, atajos para interacciones ya juzgadas, el streaming SSE para no dejar la UI en silencio, y la publicación en Render. La memoria persistente no es un chat histórico en la nube: es el índice Chroma del reglamento, que sobrevive al reinicio. El historial de la partida vive en RAM a propósito (privacidad).</w:t>
       </w:r>
     </w:p>
     <w:p>
@@ -804,7 +804,7 @@
           <w:i/>
           <w:sz w:val="20"/>
         </w:rPr>
-        <w:t>flowchart LR  |  U[Jugador] --&gt; UI[Chat web] --&gt; API[FastAPI] --&gt; V[minicpm-v] / C[cards.json] / R[ChromaDB] / H[historial] / D[draft] --&gt; F[verifier] --&gt; UI</w:t>
+        <w:t>flowchart LR  |  U[Jugador] --&gt; UI[Chat web] --&gt; API[FastAPI] --&gt; V[Gemini Vision / minicpm-v local] / C[cards.json] / R[ChromaDB] / H[historial] / D[draft] --&gt; F[verifier] --&gt; UI</w:t>
       </w:r>
     </w:p>
     <w:p>
@@ -1378,7 +1378,60 @@
                 <w:i w:val="0"/>
                 <w:sz w:val="18"/>
               </w:rPr>
-              <w:t>Chroma para RAG del reglamento. SQLite/Postgres no aportan: no hay usuarios. Las cartas van en JSON para no alucinar el texto.</w:t>
+              <w:t>Chroma para RAG del reglamento, con el índice ya construido y versionado. SQLite/Postgres no aportan: no hay usuarios. Las cartas van en JSON para no alucinar el texto.</w:t>
+            </w:r>
+          </w:p>
+        </w:tc>
+      </w:tr>
+      <w:tr>
+        <w:tc>
+          <w:tcPr>
+            <w:tcW w:type="dxa" w:w="1814"/>
+          </w:tcPr>
+          <w:p>
+            <w:r/>
+            <w:r>
+              <w:rPr>
+                <w:rFonts w:ascii="Calibri" w:hAnsi="Calibri" w:eastAsia="Calibri"/>
+                <w:b w:val="0"/>
+                <w:i w:val="0"/>
+                <w:sz w:val="18"/>
+              </w:rPr>
+              <w:t>Embeddings</w:t>
+            </w:r>
+          </w:p>
+        </w:tc>
+        <w:tc>
+          <w:tcPr>
+            <w:tcW w:type="dxa" w:w="2438"/>
+          </w:tcPr>
+          <w:p>
+            <w:r/>
+            <w:r>
+              <w:rPr>
+                <w:rFonts w:ascii="Calibri" w:hAnsi="Calibri" w:eastAsia="Calibri"/>
+                <w:b w:val="0"/>
+                <w:i w:val="0"/>
+                <w:sz w:val="18"/>
+              </w:rPr>
+              <w:t>API de Gemini (gemini-embedding-001)</w:t>
+            </w:r>
+          </w:p>
+        </w:tc>
+        <w:tc>
+          <w:tcPr>
+            <w:tcW w:type="dxa" w:w="5386"/>
+          </w:tcPr>
+          <w:p>
+            <w:r/>
+            <w:r>
+              <w:rPr>
+                <w:rFonts w:ascii="Calibri" w:hAnsi="Calibri" w:eastAsia="Calibri"/>
+                <w:b w:val="0"/>
+                <w:i w:val="0"/>
+                <w:sz w:val="18"/>
+              </w:rPr>
+              <w:t>Empezó con sentence-transformers local, pero eso arrastra PyTorch y el plan gratuito de Render (512 MB) moría por falta de memoria. Los embeddings por API son multilingües y dejan el servidor sin modelos cargados. Medido: la suite de juez dio el mismo 5/7 antes y después del cambio.</w:t>
             </w:r>
           </w:p>
         </w:tc>
@@ -1414,7 +1467,7 @@
                 <w:i w:val="0"/>
                 <w:sz w:val="18"/>
               </w:rPr>
-              <w:t>Gemini Flash (nube) + minicpm-v (local)</w:t>
+              <w:t>Gemini Flash + Gemini Vision; minicpm-v local</w:t>
             </w:r>
           </w:p>
         </w:tc>
@@ -1431,7 +1484,7 @@
                 <w:i w:val="0"/>
                 <w:sz w:val="18"/>
               </w:rPr>
-              <w:t>Qwen3 8B local no obedecía el prompt de juez. Gemma Cloud dio 403. Gemini 2.0 Flash lo retiraron. Flash vigente: gratis y breve. Visión local para no mezclar OCR con el ruling.</w:t>
+              <w:t>Qwen3 8B local no obedecía el prompt de juez. Flash vigente: gratis y breve. Gemini solo identifica número/nombre de la foto; cards.json aporta el texto exacto. En local puede usarse minicpm-v.</w:t>
             </w:r>
           </w:p>
         </w:tc>
@@ -1520,7 +1573,7 @@
                 <w:i w:val="0"/>
                 <w:sz w:val="18"/>
               </w:rPr>
-              <w:t>PC del estudiante + Cloudflare Tunnel</w:t>
+              <w:t>Render (Docker, plan Free)</w:t>
             </w:r>
           </w:p>
         </w:tc>
@@ -1537,7 +1590,7 @@
                 <w:i w:val="0"/>
                 <w:sz w:val="18"/>
               </w:rPr>
-              <w:t>Sin VPS ni GPU en la nube. El túnel publica HTTPS. Ollama (fotos) solo existe en esta máquina; en Render se perdería la visión.</w:t>
+              <w:t>Da una URL HTTPS estable sin depender de la PC. El límite de 512 MB obligó a sacar PyTorch: el índice Chroma se construye antes y los embeddings/visión salen por Gemini API.</w:t>
             </w:r>
           </w:p>
         </w:tc>
@@ -2699,7 +2752,7 @@
                 <w:i w:val="0"/>
                 <w:sz w:val="18"/>
               </w:rPr>
-              <w:t>No se guardan imágenes ni historial en disco. El historial vive en RAM del proceso. Gemini sí recibe el texto (y el contexto de reglas) en la nube: no es un juez 100 % on-prem.</w:t>
+              <w:t>No se guardan imágenes ni historial en disco. En producción la foto se envía a Gemini solo para identificar la carta; el historial vive en RAM. En local puede usarse Ollama para que la imagen no salga de la PC.</w:t>
             </w:r>
           </w:p>
         </w:tc>
@@ -2752,7 +2805,7 @@
                 <w:i w:val="0"/>
                 <w:sz w:val="18"/>
               </w:rPr>
-              <w:t>No hay login: es un juez público de reglas (dato no sensible). El túnel no abre RDP ni el filesystem. Riesgo residual: abuso de cuota Gemini si alguien bombardea /ask.</w:t>
+              <w:t>No hay login: es un juez público de reglas (dato no sensible). Render expone solo FastAPI, no el filesystem. Riesgo residual: abuso de cuota Gemini si alguien bombardea /ask.</w:t>
             </w:r>
           </w:p>
         </w:tc>
@@ -3085,7 +3138,7 @@
                 <w:i w:val="0"/>
                 <w:sz w:val="18"/>
               </w:rPr>
-              <w:t>minicpm-v</w:t>
+              <w:t>Gemini Vision / minicpm-v</w:t>
             </w:r>
           </w:p>
         </w:tc>
@@ -3119,7 +3172,7 @@
                 <w:i w:val="0"/>
                 <w:sz w:val="18"/>
               </w:rPr>
-              <w:t>Bien en su rol. Al principio mezclaba prints (Kennen sin subtítulo); se cambió el prompt a Name + Subtitle.</w:t>
+              <w:t>Gemini se usa en Render y minicpm-v localmente. Ambos solo identifican; cards.json es la fuente del texto. Al principio minicpm-v mezclaba prints y se agregó Name + Subtitle.</w:t>
             </w:r>
           </w:p>
         </w:tc>
@@ -3220,7 +3273,7 @@
           <w:i w:val="0"/>
           <w:sz w:val="22"/>
         </w:rPr>
-        <w:t>1. Papel de un LLM/SLM local. Ya hay un SLM local en producción: minicpm-v, subagente de visión. No reemplaza a Gemini como juez. Se probó reemplazar el agente principal con Qwen3 8B y no cumplió el contrato de juez (brevedad, vocabulario, citar la carta). Un LLM local más capaz (Llama 3.1 70B, etc.) reemplazaría el draft/verifier para no mandar jugadas de un grupo a Google, pero no entra en una PC de escritorio razonable. El rol realista hoy: visión + quizá un filtro de prompt injection, no el Head Judge.</w:t>
+        <w:t>1. Papel de un LLM/SLM local. Ya hay un SLM local disponible: minicpm-v, subagente de visión. En Render ese rol lo toma Gemini porque no hay GPU, pero localmente evita enviar fotos a terceros. No reemplaza a Gemini como juez. Se probó reemplazar el agente principal con Qwen3 8B y no cumplió el contrato de juez (brevedad, vocabulario, citar la carta). Un LLM local más capaz (Llama 3.1 70B, etc.) reemplazaría el draft/verifier para no mandar jugadas de un grupo a Google, pero no entra en una PC de escritorio razonable. El rol realista hoy: visión + quizá un filtro de prompt injection, no el Head Judge.</w:t>
       </w:r>
     </w:p>
     <w:p>
@@ -3234,7 +3287,7 @@
           <w:i w:val="0"/>
           <w:sz w:val="22"/>
         </w:rPr>
-        <w:t>2. Aporte al usuario. La visión local sí cambia lo que puede pedir: saca la foto de la mesa y no tiene que tipear OGN-195. Es más privado (la imagen no viaja a Gemini) y no tiene costo por token de visión. No es más rápido en el ruling: el cuello es Flash + verifier. Un juez 100 % local mejoraría privacidad y seguiría andando sin internet; hoy, si se corta la API, el bot se abstiene.</w:t>
+        <w:t>2. Aporte al usuario. La visión cambia lo que puede pedir: saca la foto de la mesa y no tiene que tipear OGN-195. La variante local es más privada (la imagen no viaja a Gemini) y no tiene costo por token de visión; la variante publicada permite la misma UX sin GPU. No es más rápido en el ruling: el cuello es Flash + verifier. Un juez 100 % local mejoraría privacidad y seguiría andando sin internet; hoy, si se corta la API, el bot se abstiene.</w:t>
       </w:r>
     </w:p>
     <w:p>
@@ -3262,7 +3315,7 @@
           <w:i w:val="0"/>
           <w:sz w:val="22"/>
         </w:rPr>
-        <w:t>4. Limitaciones vs API en la nube. Hardware: esta PC corre minicpm-v; no corre un juez al nivel de Flash. Calidad: Qwen 8B falló el caso de uso. Cuota y retiro de modelos: el problema de la nube. Mantenimiento: hay que pullear pesos, versionar Modelfile y re-correr judge_cases.json cada vez que Ollama actualiza. Conclusión: híbrido a propósito (visión local, juez en API), no por no haber pensado lo local.</w:t>
+        <w:t>4. Limitaciones vs API en la nube. Hardware: esta PC corre minicpm-v; no corre un juez al nivel de Flash. Calidad: Qwen 8B falló el caso de uso. Cuota y retiro de modelos: el problema de la nube. Mantenimiento: hay que pullear pesos, versionar Modelfile y re-correr judge_cases.json cada vez que Ollama actualiza. Conclusión: híbrido a propósito (visión local opcional y visión/juez por API en producción), no por no haber pensado lo local.</w:t>
       </w:r>
     </w:p>
     <w:p>

</xml_diff>

<commit_message>
Incluir el video de demo y las capturas de produccion en el informe.
Co-authored-by: Cursor <cursoragent@cursor.com>
</commit_message>
<xml_diff>
--- a/informe/Entrega_final_Riftbound_Chatbot.docx
+++ b/informe/Entrega_final_Riftbound_Chatbot.docx
@@ -284,7 +284,7 @@
                 <w:i w:val="0"/>
                 <w:sz w:val="18"/>
               </w:rPr>
-              <w:t>Opcional — se carga si hay demo de ≤ 3 min</w:t>
+              <w:t>https://youtu.be/I7B1EFWfUKE</w:t>
             </w:r>
           </w:p>
         </w:tc>
@@ -374,7 +374,7 @@
           <w:i/>
           <w:sz w:val="20"/>
         </w:rPr>
-        <w:t>Si la URL pública figura como PENDIENTE al exportar este PDF, completar después de levantar Cloudflare Tunnel (start_publico.bat + cloudflared) y volver a generar el informe.</w:t>
+        <w:t>La app está publicada en Render. El primer acceso después de un rato inactivo puede tardar ~50 s (plan gratuito). Abrir la URL antes de la corrección.</w:t>
       </w:r>
     </w:p>
     <w:p>
@@ -1624,7 +1624,7 @@
           <w:i w:val="0"/>
           <w:sz w:val="22"/>
         </w:rPr>
-        <w:t>La UI de producción es el chat (el valor está en la respuesta, no en un onboarding). Las tres pantallas de diseño (bienvenida, chat, config) están en Figma; abajo se reusan esas capturas y el flujo real del prototipo funcional.</w:t>
+        <w:t>Capturas de la aplicación publicada en Render (https://riftbound-rules-chatbot.onrender.com), no de un mock. El flujo: el jugador entra, pregunta o adjunta una carta, y obtiene veredicto, confianza, explicación y evidencia clicable.</w:t>
       </w:r>
     </w:p>
     <w:p>
@@ -1634,7 +1634,7 @@
       <w:r>
         <w:drawing>
           <wp:inline xmlns:a="http://schemas.openxmlformats.org/drawingml/2006/main" xmlns:pic="http://schemas.openxmlformats.org/drawingml/2006/picture">
-            <wp:extent cx="5120640" cy="2934876"/>
+            <wp:extent cx="5669280" cy="2961977"/>
             <wp:docPr id="4" name="Picture 4"/>
             <wp:cNvGraphicFramePr>
               <a:graphicFrameLocks noChangeAspect="1"/>
@@ -1643,7 +1643,7 @@
               <a:graphicData uri="http://schemas.openxmlformats.org/drawingml/2006/picture">
                 <pic:pic>
                   <pic:nvPicPr>
-                    <pic:cNvPr id="0" name="tp1_p4_1.png"/>
+                    <pic:cNvPr id="0" name="prod_defy.jpg"/>
                     <pic:cNvPicPr/>
                   </pic:nvPicPr>
                   <pic:blipFill>
@@ -1655,7 +1655,7 @@
                   <pic:spPr>
                     <a:xfrm>
                       <a:off x="0" y="0"/>
-                      <a:ext cx="5120640" cy="2934876"/>
+                      <a:ext cx="5669280" cy="2961977"/>
                     </a:xfrm>
                     <a:prstGeom prst="rect"/>
                   </pic:spPr>
@@ -1679,7 +1679,7 @@
           <w:color w:val="444455"/>
           <w:sz w:val="18"/>
         </w:rPr>
-        <w:t>Figura 4. Home / bienvenida (prototipo Figma).</w:t>
+        <w:t>Figura 4. Producción: foto de Defy identificada por Gemini Vision. Veredicto SI, confianza ALTA, evidencia Defy (cards.json) y regla 206.</w:t>
       </w:r>
     </w:p>
     <w:p>
@@ -1689,7 +1689,7 @@
       <w:r>
         <w:drawing>
           <wp:inline xmlns:a="http://schemas.openxmlformats.org/drawingml/2006/main" xmlns:pic="http://schemas.openxmlformats.org/drawingml/2006/picture">
-            <wp:extent cx="5120640" cy="2905760"/>
+            <wp:extent cx="5669280" cy="2945368"/>
             <wp:docPr id="5" name="Picture 5"/>
             <wp:cNvGraphicFramePr>
               <a:graphicFrameLocks noChangeAspect="1"/>
@@ -1698,7 +1698,7 @@
               <a:graphicData uri="http://schemas.openxmlformats.org/drawingml/2006/picture">
                 <pic:pic>
                   <pic:nvPicPr>
-                    <pic:cNvPr id="0" name="tp1_p4_2.png"/>
+                    <pic:cNvPr id="0" name="prod_repeat.jpg"/>
                     <pic:cNvPicPr/>
                   </pic:nvPicPr>
                   <pic:blipFill>
@@ -1710,7 +1710,7 @@
                   <pic:spPr>
                     <a:xfrm>
                       <a:off x="0" y="0"/>
-                      <a:ext cx="5120640" cy="2905760"/>
+                      <a:ext cx="5669280" cy="2945368"/>
                     </a:xfrm>
                     <a:prstGeom prst="rect"/>
                   </pic:spPr>
@@ -1734,7 +1734,21 @@
           <w:color w:val="444455"/>
           <w:sz w:val="18"/>
         </w:rPr>
-        <w:t>Figura 5. Flujo principal: el jugador pregunta y adjunta carta.</w:t>
+        <w:t>Figura 5. Producción: Repeat + Defy. Veredicto NO, reglas 425.1 y 820.1: si el hechizo es countereado no hay resolución y Repeat no se ejecuta.</w:t>
+      </w:r>
+    </w:p>
+    <w:p>
+      <w:pPr>
+        <w:spacing w:after="160" w:line="276" w:lineRule="auto"/>
+      </w:pPr>
+      <w:r>
+        <w:rPr>
+          <w:rFonts w:ascii="Calibri" w:hAnsi="Calibri" w:eastAsia="Calibri"/>
+          <w:b w:val="0"/>
+          <w:i w:val="0"/>
+          <w:sz w:val="22"/>
+        </w:rPr>
+        <w:t>Las tres pantallas de diseño (bienvenida, chat, config) siguen en Figma; abajo se conservan como prototipo de interfaz, no como el sitio live.</w:t>
       </w:r>
     </w:p>
     <w:p>
@@ -1744,7 +1758,7 @@
       <w:r>
         <w:drawing>
           <wp:inline xmlns:a="http://schemas.openxmlformats.org/drawingml/2006/main" xmlns:pic="http://schemas.openxmlformats.org/drawingml/2006/picture">
-            <wp:extent cx="5120640" cy="2922160"/>
+            <wp:extent cx="4754880" cy="2725242"/>
             <wp:docPr id="6" name="Picture 6"/>
             <wp:cNvGraphicFramePr>
               <a:graphicFrameLocks noChangeAspect="1"/>
@@ -1753,7 +1767,7 @@
               <a:graphicData uri="http://schemas.openxmlformats.org/drawingml/2006/picture">
                 <pic:pic>
                   <pic:nvPicPr>
-                    <pic:cNvPr id="0" name="tp1_p5_1.png"/>
+                    <pic:cNvPr id="0" name="tp1_p4_1.png"/>
                     <pic:cNvPicPr/>
                   </pic:nvPicPr>
                   <pic:blipFill>
@@ -1765,7 +1779,7 @@
                   <pic:spPr>
                     <a:xfrm>
                       <a:off x="0" y="0"/>
-                      <a:ext cx="5120640" cy="2922160"/>
+                      <a:ext cx="4754880" cy="2725242"/>
                     </a:xfrm>
                     <a:prstGeom prst="rect"/>
                   </pic:spPr>
@@ -1789,7 +1803,117 @@
           <w:color w:val="444455"/>
           <w:sz w:val="18"/>
         </w:rPr>
-        <w:t>Figura 6. Configuración objetivo (modelo breve vs juez detallado). En el código actual el modo es siempre juez con citas.</w:t>
+        <w:t>Figura 6. Home / bienvenida (prototipo Figma).</w:t>
+      </w:r>
+    </w:p>
+    <w:p>
+      <w:pPr>
+        <w:jc w:val="center"/>
+      </w:pPr>
+      <w:r>
+        <w:drawing>
+          <wp:inline xmlns:a="http://schemas.openxmlformats.org/drawingml/2006/main" xmlns:pic="http://schemas.openxmlformats.org/drawingml/2006/picture">
+            <wp:extent cx="4754880" cy="2698206"/>
+            <wp:docPr id="7" name="Picture 7"/>
+            <wp:cNvGraphicFramePr>
+              <a:graphicFrameLocks noChangeAspect="1"/>
+            </wp:cNvGraphicFramePr>
+            <a:graphic>
+              <a:graphicData uri="http://schemas.openxmlformats.org/drawingml/2006/picture">
+                <pic:pic>
+                  <pic:nvPicPr>
+                    <pic:cNvPr id="0" name="tp1_p4_2.png"/>
+                    <pic:cNvPicPr/>
+                  </pic:nvPicPr>
+                  <pic:blipFill>
+                    <a:blip r:embed="rId15"/>
+                    <a:stretch>
+                      <a:fillRect/>
+                    </a:stretch>
+                  </pic:blipFill>
+                  <pic:spPr>
+                    <a:xfrm>
+                      <a:off x="0" y="0"/>
+                      <a:ext cx="4754880" cy="2698206"/>
+                    </a:xfrm>
+                    <a:prstGeom prst="rect"/>
+                  </pic:spPr>
+                </pic:pic>
+              </a:graphicData>
+            </a:graphic>
+          </wp:inline>
+        </w:drawing>
+      </w:r>
+    </w:p>
+    <w:p>
+      <w:pPr>
+        <w:spacing w:after="240"/>
+        <w:jc w:val="center"/>
+      </w:pPr>
+      <w:r>
+        <w:rPr>
+          <w:rFonts w:ascii="Calibri" w:hAnsi="Calibri" w:eastAsia="Calibri"/>
+          <w:b w:val="0"/>
+          <w:i/>
+          <w:color w:val="444455"/>
+          <w:sz w:val="18"/>
+        </w:rPr>
+        <w:t>Figura 7. Flujo principal de consulta (prototipo Figma).</w:t>
+      </w:r>
+    </w:p>
+    <w:p>
+      <w:pPr>
+        <w:jc w:val="center"/>
+      </w:pPr>
+      <w:r>
+        <w:drawing>
+          <wp:inline xmlns:a="http://schemas.openxmlformats.org/drawingml/2006/main" xmlns:pic="http://schemas.openxmlformats.org/drawingml/2006/picture">
+            <wp:extent cx="4754880" cy="2713435"/>
+            <wp:docPr id="8" name="Picture 8"/>
+            <wp:cNvGraphicFramePr>
+              <a:graphicFrameLocks noChangeAspect="1"/>
+            </wp:cNvGraphicFramePr>
+            <a:graphic>
+              <a:graphicData uri="http://schemas.openxmlformats.org/drawingml/2006/picture">
+                <pic:pic>
+                  <pic:nvPicPr>
+                    <pic:cNvPr id="0" name="tp1_p5_1.png"/>
+                    <pic:cNvPicPr/>
+                  </pic:nvPicPr>
+                  <pic:blipFill>
+                    <a:blip r:embed="rId16"/>
+                    <a:stretch>
+                      <a:fillRect/>
+                    </a:stretch>
+                  </pic:blipFill>
+                  <pic:spPr>
+                    <a:xfrm>
+                      <a:off x="0" y="0"/>
+                      <a:ext cx="4754880" cy="2713435"/>
+                    </a:xfrm>
+                    <a:prstGeom prst="rect"/>
+                  </pic:spPr>
+                </pic:pic>
+              </a:graphicData>
+            </a:graphic>
+          </wp:inline>
+        </w:drawing>
+      </w:r>
+    </w:p>
+    <w:p>
+      <w:pPr>
+        <w:spacing w:after="240"/>
+        <w:jc w:val="center"/>
+      </w:pPr>
+      <w:r>
+        <w:rPr>
+          <w:rFonts w:ascii="Calibri" w:hAnsi="Calibri" w:eastAsia="Calibri"/>
+          <w:b w:val="0"/>
+          <w:i/>
+          <w:color w:val="444455"/>
+          <w:sz w:val="18"/>
+        </w:rPr>
+        <w:t>Figura 8. Configuración objetivo (Figma). En producción el modo es siempre juez con citas.</w:t>
       </w:r>
     </w:p>
     <w:p>
@@ -2302,7 +2426,7 @@
                 <w:i w:val="0"/>
                 <w:sz w:val="18"/>
               </w:rPr>
-              <w:t>Ctrl+V de fotos, números OGN-xxx. No hay atajos de ‘casos frecuentes’ en producción (sí en Figma como chips).</w:t>
+              <w:t>Ctrl+V de fotos, números OGN-xxx y chips de ejemplo (Defy, Deathknell, Repeat).</w:t>
             </w:r>
           </w:p>
         </w:tc>
@@ -3340,7 +3464,7 @@
         <w:drawing>
           <wp:inline xmlns:a="http://schemas.openxmlformats.org/drawingml/2006/main" xmlns:pic="http://schemas.openxmlformats.org/drawingml/2006/picture">
             <wp:extent cx="3657600" cy="3687499"/>
-            <wp:docPr id="7" name="Picture 7"/>
+            <wp:docPr id="9" name="Picture 9"/>
             <wp:cNvGraphicFramePr>
               <a:graphicFrameLocks noChangeAspect="1"/>
             </wp:cNvGraphicFramePr>
@@ -3352,7 +3476,7 @@
                     <pic:cNvPicPr/>
                   </pic:nvPicPr>
                   <pic:blipFill>
-                    <a:blip r:embed="rId15"/>
+                    <a:blip r:embed="rId17"/>
                     <a:stretch>
                       <a:fillRect/>
                     </a:stretch>
@@ -3384,7 +3508,7 @@
           <w:color w:val="444455"/>
           <w:sz w:val="18"/>
         </w:rPr>
-        <w:t>Figura 7. Exploración de estilo (Leonardo.ai) de la entrega anterior: paleta, no el producto.</w:t>
+        <w:t>Figura 9. Exploración de estilo (Leonardo.ai) de la entrega anterior: paleta, no el producto.</w:t>
       </w:r>
     </w:p>
     <w:p>

</xml_diff>